<commit_message>
Hergenereer case-template met echte <ul><li> bullets
Template gebruikt nu Word numbering (w:numPr) i.p.v. handmatig
voorafgaande bullet-tekens. Mammoth leest dit correct als <ul><li>,
zodat TipTap's bullet-toggle blijft werken na import.

Co-Authored-By: Claude Opus 4.7 <noreply@anthropic.com>
</commit_message>
<xml_diff>
--- a/public/case-template.docx
+++ b/public/case-template.docx
@@ -1724,6 +1724,21 @@
       </w:rPr>
     </w:lvl>
   </w:abstractNum>
+  <w:abstractNum w:abstractNumId="9">
+    <w:multiLevelType w:val="hybridMultilevel"/>
+    <w:lvl w:ilvl="0">
+      <w:start w:val="1"/>
+      <w:numFmt w:val="bullet"/>
+      <w:lvlText w:val="•"/>
+      <w:lvlJc w:val="left"/>
+      <w:pPr>
+        <w:ind w:left="720" w:hanging="360"/>
+      </w:pPr>
+      <w:rPr>
+        <w:rFonts w:ascii="Symbol" w:hAnsi="Symbol" w:hint="default"/>
+      </w:rPr>
+    </w:lvl>
+  </w:abstractNum>
   <w:num w:numId="1">
     <w:abstractNumId w:val="8"/>
   </w:num>
@@ -1750,6 +1765,9 @@
   </w:num>
   <w:num w:numId="9">
     <w:abstractNumId w:val="0"/>
+  </w:num>
+  <w:num w:numId="10">
+    <w:abstractNumId w:val="9"/>
   </w:num>
 </w:numbering>
 </file>

</xml_diff>

<commit_message>
Integreer navigatie en cases-overzicht, voeg zoekfunctie toe
- Landing is nu cases-overzicht (ipv lege state)
- Globale zoekbalk in topbar met 'terug naar totaal overzicht'
- Filter scopet grid en toont talking points inline (geen view-switch)
- Nieuwe case via timestamp-ID + inline naam bewerken (geen window.prompt)
- Knoppen in teal huisstijl, zonder icons
- PowerPoint export herwerkt naar light-theme praatplaat

Co-Authored-By: Claude Opus 4.7 <noreply@anthropic.com>
</commit_message>
<xml_diff>
--- a/public/case-template.docx
+++ b/public/case-template.docx
@@ -2,6 +2,31 @@
 <file path=word/document.xml><?xml version="1.0" encoding="utf-8"?>
 <w:document xmlns:wpc="http://schemas.microsoft.com/office/word/2010/wordprocessingCanvas" xmlns:mo="http://schemas.microsoft.com/office/mac/office/2008/main" xmlns:mc="http://schemas.openxmlformats.org/markup-compatibility/2006" xmlns:mv="urn:schemas-microsoft-com:mac:vml" xmlns:o="urn:schemas-microsoft-com:office:office" xmlns:r="http://schemas.openxmlformats.org/officeDocument/2006/relationships" xmlns:m="http://schemas.openxmlformats.org/officeDocument/2006/math" xmlns:v="urn:schemas-microsoft-com:vml" xmlns:wp14="http://schemas.microsoft.com/office/word/2010/wordprocessingDrawing" xmlns:wp="http://schemas.openxmlformats.org/drawingml/2006/wordprocessingDrawing" xmlns:w10="urn:schemas-microsoft-com:office:word" xmlns:w="http://schemas.openxmlformats.org/wordprocessingml/2006/main" xmlns:w14="http://schemas.microsoft.com/office/word/2010/wordml" xmlns:wpg="http://schemas.microsoft.com/office/word/2010/wordprocessingGroup" xmlns:wpi="http://schemas.microsoft.com/office/word/2010/wordprocessingInk" xmlns:wne="http://schemas.microsoft.com/office/word/2006/wordml" xmlns:wps="http://schemas.microsoft.com/office/word/2010/wordprocessingShape" mc:Ignorable="w14 wp14">
   <w:body>
+    <w:p>
+      <w:pPr>
+        <w:spacing w:before="0" w:after="20" w:line="300" w:lineRule="auto"/>
+      </w:pPr>
+      <w:r>
+        <w:rPr>
+          <w:rFonts w:ascii="Nunito Sans" w:hAnsi="Nunito Sans" w:cs="Nunito Sans"/>
+          <w:b/>
+          <w:i w:val="0"/>
+          <w:color w:val="2C3C52"/>
+          <w:sz w:val="40"/>
+        </w:rPr>
+        <w:t xml:space="preserve">Sales </w:t>
+      </w:r>
+      <w:r>
+        <w:rPr>
+          <w:rFonts w:ascii="Nunito Sans" w:hAnsi="Nunito Sans" w:cs="Nunito Sans"/>
+          <w:b/>
+          <w:i w:val="0"/>
+          <w:color w:val="ED174B"/>
+          <w:sz w:val="40"/>
+        </w:rPr>
+        <w:t>Navigator</w:t>
+      </w:r>
+    </w:p>
     <w:p>
       <w:pPr>
         <w:spacing w:before="0" w:after="40" w:line="300" w:lineRule="auto"/>
@@ -15,7 +40,7 @@
           <w:b/>
           <w:i w:val="0"/>
           <w:color w:val="2C3C52"/>
-          <w:sz w:val="36"/>
+          <w:sz w:val="20"/>
         </w:rPr>
         <w:t>creates</w:t>
       </w:r>
@@ -25,29 +50,9 @@
           <w:b/>
           <w:i w:val="0"/>
           <w:color w:val="ED174B"/>
-          <w:sz w:val="36"/>
+          <w:sz w:val="20"/>
         </w:rPr>
         <w:t>.</w:t>
-      </w:r>
-      <w:r>
-        <w:rPr>
-          <w:rFonts w:ascii="Nunito Sans" w:hAnsi="Nunito Sans" w:cs="Nunito Sans"/>
-          <w:b/>
-          <w:i w:val="0"/>
-          <w:color w:val="2C3C52"/>
-          <w:sz w:val="26"/>
-        </w:rPr>
-        <w:t xml:space="preserve">   Sales </w:t>
-      </w:r>
-      <w:r>
-        <w:rPr>
-          <w:rFonts w:ascii="Nunito Sans" w:hAnsi="Nunito Sans" w:cs="Nunito Sans"/>
-          <w:b/>
-          <w:i w:val="0"/>
-          <w:color w:val="ED174B"/>
-          <w:sz w:val="26"/>
-        </w:rPr>
-        <w:t>Navigator</w:t>
       </w:r>
     </w:p>
     <w:p>

</xml_diff>